<commit_message>
Harden IR standard grounding and expose template JSON export.
Keep family/table values tied to their own printed rows, drop label-echo and ungrounded model text, and add a /template.json endpoint that mirrors the standard layout for review.
</commit_message>
<xml_diff>
--- a/app/ir_standard/templates/IR_Standard_Blank.docx
+++ b/app/ir_standard/templates/IR_Standard_Blank.docx
@@ -574,6 +574,19 @@
                 <w:sz w:val="18"/>
               </w:rPr>
               <w:t>☐ BC</w:t>
+            </w:r>
+          </w:p>
+          <w:p>
+            <w:pPr>
+              <w:spacing w:after="0"/>
+            </w:pPr>
+            <w:r>
+              <w:rPr>
+                <w:rFonts w:ascii="Calibri" w:hAnsi="Calibri"/>
+                <w:b w:val="0"/>
+                <w:sz w:val="18"/>
+              </w:rPr>
+              <w:t>☐ OC</w:t>
             </w:r>
           </w:p>
           <w:p>

</xml_diff>